<commit_message>
New embeddings and performance measures for mpMRI
</commit_message>
<xml_diff>
--- a/mpMRI/CHIMERA/results_ML_Radiology_GPU/performance_comparison.docx
+++ b/mpMRI/CHIMERA/results_ML_Radiology_GPU/performance_comparison.docx
@@ -9463,6 +9463,12 @@
     <w:p>
       <w:pPr>
         <w:jc w:val="both"/>
+        <w:rPr>
+          <w:rFonts w:ascii="-webkit-standard" w:hAnsi="-webkit-standard"/>
+          <w:color w:val="000000"/>
+          <w:sz w:val="27"/>
+          <w:szCs w:val="27"/>
+        </w:rPr>
       </w:pPr>
       <w:r>
         <w:rPr>
@@ -9473,6 +9479,579 @@
         </w:rPr>
         <w:t>Changing the architecture helped more than changing the threshold or class weights.</w:t>
       </w:r>
+    </w:p>
+    <w:p>
+      <w:pPr>
+        <w:jc w:val="both"/>
+        <w:rPr>
+          <w:rFonts w:ascii="-webkit-standard" w:hAnsi="-webkit-standard"/>
+          <w:color w:val="000000"/>
+          <w:sz w:val="27"/>
+          <w:szCs w:val="27"/>
+        </w:rPr>
+      </w:pPr>
+    </w:p>
+    <w:p>
+      <w:pPr>
+        <w:jc w:val="both"/>
+        <w:rPr>
+          <w:rFonts w:ascii="-webkit-standard" w:hAnsi="-webkit-standard"/>
+          <w:color w:val="000000"/>
+          <w:sz w:val="27"/>
+          <w:szCs w:val="27"/>
+        </w:rPr>
+      </w:pPr>
+    </w:p>
+    <w:p>
+      <w:pPr>
+        <w:jc w:val="both"/>
+        <w:rPr>
+          <w:rFonts w:ascii="-webkit-standard" w:hAnsi="-webkit-standard"/>
+          <w:color w:val="000000"/>
+          <w:sz w:val="27"/>
+          <w:szCs w:val="27"/>
+        </w:rPr>
+      </w:pPr>
+    </w:p>
+    <w:p>
+      <w:pPr>
+        <w:jc w:val="both"/>
+        <w:rPr>
+          <w:rFonts w:ascii="-webkit-standard" w:hAnsi="-webkit-standard"/>
+          <w:color w:val="000000"/>
+          <w:sz w:val="27"/>
+          <w:szCs w:val="27"/>
+        </w:rPr>
+      </w:pPr>
+    </w:p>
+    <w:p>
+      <w:pPr>
+        <w:jc w:val="both"/>
+        <w:rPr>
+          <w:rFonts w:ascii="-webkit-standard" w:hAnsi="-webkit-standard"/>
+          <w:color w:val="000000"/>
+          <w:sz w:val="27"/>
+          <w:szCs w:val="27"/>
+        </w:rPr>
+      </w:pPr>
+    </w:p>
+    <w:p>
+      <w:pPr>
+        <w:jc w:val="both"/>
+        <w:rPr>
+          <w:rFonts w:ascii="-webkit-standard" w:hAnsi="-webkit-standard"/>
+          <w:color w:val="000000"/>
+          <w:sz w:val="27"/>
+          <w:szCs w:val="27"/>
+        </w:rPr>
+      </w:pPr>
+    </w:p>
+    <w:p>
+      <w:pPr>
+        <w:jc w:val="both"/>
+        <w:rPr>
+          <w:rFonts w:ascii="-webkit-standard" w:hAnsi="-webkit-standard"/>
+          <w:color w:val="000000"/>
+          <w:sz w:val="27"/>
+          <w:szCs w:val="27"/>
+        </w:rPr>
+      </w:pPr>
+    </w:p>
+    <w:p>
+      <w:pPr>
+        <w:jc w:val="both"/>
+        <w:rPr>
+          <w:rFonts w:ascii="-webkit-standard" w:hAnsi="-webkit-standard"/>
+          <w:color w:val="000000"/>
+          <w:sz w:val="27"/>
+          <w:szCs w:val="27"/>
+        </w:rPr>
+      </w:pPr>
+    </w:p>
+    <w:p>
+      <w:pPr>
+        <w:jc w:val="both"/>
+        <w:rPr>
+          <w:rFonts w:ascii="-webkit-standard" w:hAnsi="-webkit-standard"/>
+          <w:color w:val="000000"/>
+          <w:sz w:val="27"/>
+          <w:szCs w:val="27"/>
+        </w:rPr>
+      </w:pPr>
+    </w:p>
+    <w:p>
+      <w:pPr>
+        <w:jc w:val="both"/>
+        <w:rPr>
+          <w:rFonts w:ascii="-webkit-standard" w:hAnsi="-webkit-standard"/>
+          <w:color w:val="000000"/>
+          <w:sz w:val="27"/>
+          <w:szCs w:val="27"/>
+        </w:rPr>
+      </w:pPr>
+    </w:p>
+    <w:p>
+      <w:pPr>
+        <w:jc w:val="both"/>
+        <w:rPr>
+          <w:rFonts w:ascii="-webkit-standard" w:hAnsi="-webkit-standard"/>
+          <w:color w:val="000000"/>
+          <w:sz w:val="27"/>
+          <w:szCs w:val="27"/>
+        </w:rPr>
+      </w:pPr>
+    </w:p>
+    <w:p>
+      <w:pPr>
+        <w:jc w:val="both"/>
+        <w:rPr>
+          <w:rFonts w:ascii="-webkit-standard" w:hAnsi="-webkit-standard"/>
+          <w:color w:val="000000"/>
+          <w:sz w:val="27"/>
+          <w:szCs w:val="27"/>
+        </w:rPr>
+      </w:pPr>
+      <w:r>
+        <w:rPr>
+          <w:rFonts w:ascii="-webkit-standard" w:hAnsi="-webkit-standard"/>
+          <w:color w:val="000000"/>
+          <w:sz w:val="27"/>
+          <w:szCs w:val="27"/>
+        </w:rPr>
+        <w:lastRenderedPageBreak/>
+        <w:t xml:space="preserve">Methods: </w:t>
+      </w:r>
+    </w:p>
+    <w:p>
+      <w:pPr>
+        <w:jc w:val="both"/>
+        <w:rPr>
+          <w:rFonts w:ascii="-webkit-standard" w:hAnsi="-webkit-standard"/>
+          <w:color w:val="000000"/>
+          <w:sz w:val="27"/>
+          <w:szCs w:val="27"/>
+        </w:rPr>
+      </w:pPr>
+    </w:p>
+    <w:p>
+      <w:pPr>
+        <w:ind w:firstLine="720"/>
+        <w:jc w:val="both"/>
+        <w:rPr>
+          <w:b/>
+          <w:bCs/>
+        </w:rPr>
+      </w:pPr>
+      <w:r>
+        <w:t>The general 3D CNN network was evaluated with different strategies regarding pooling size, pooling strategy, weighted classes, and adjusted probability threshold for prediction</w:t>
+      </w:r>
+      <w:r>
+        <w:t xml:space="preserve">, fusion approach for each mpMRI modality, and embedding representation. </w:t>
+      </w:r>
+      <w:r>
+        <w:t xml:space="preserve">The versions tested are described below. </w:t>
+      </w:r>
+      <w:r>
+        <w:rPr>
+          <w:b/>
+          <w:bCs/>
+        </w:rPr>
+        <w:t>Version 1 – Reduced Pooling:</w:t>
+      </w:r>
+      <w:r>
+        <w:t xml:space="preserve"> </w:t>
+      </w:r>
+      <w:r>
+        <w:t xml:space="preserve">Single-stream 3D CNN with all mpMRI modalities combined as input. Channel 8-&gt;16-&gt;32-&gt;64. </w:t>
+      </w:r>
+      <w:r>
+        <w:t>For this early pilot improvement, we used e</w:t>
+      </w:r>
+      <w:r>
+        <w:t>educed pooling (1,2,2), (1,2,2), (2,2,2). Global avarege pooling was used at the end (AdaptativeAveragePool(1), which turns the whole feature mao into one number per channel</w:t>
+      </w:r>
+      <w:r>
+        <w:t xml:space="preserve">; </w:t>
+      </w:r>
+      <w:r>
+        <w:rPr>
+          <w:b/>
+          <w:bCs/>
+        </w:rPr>
+        <w:t xml:space="preserve">Version 2 </w:t>
+      </w:r>
+      <w:r>
+        <w:rPr>
+          <w:b/>
+          <w:bCs/>
+        </w:rPr>
+        <w:t>–</w:t>
+      </w:r>
+      <w:r>
+        <w:rPr>
+          <w:b/>
+          <w:bCs/>
+        </w:rPr>
+        <w:t xml:space="preserve"> </w:t>
+      </w:r>
+      <w:r>
+        <w:rPr>
+          <w:b/>
+          <w:bCs/>
+        </w:rPr>
+        <w:t>AdaptativeAveragePool</w:t>
+      </w:r>
+      <w:r>
+        <w:rPr>
+          <w:b/>
+          <w:bCs/>
+          <w:color w:val="000000"/>
+        </w:rPr>
+        <w:t xml:space="preserve"> </w:t>
+      </w:r>
+      <w:r>
+        <w:rPr>
+          <w:b/>
+          <w:bCs/>
+          <w:color w:val="000000"/>
+        </w:rPr>
+        <w:t>+</w:t>
+      </w:r>
+      <w:r>
+        <w:rPr>
+          <w:b/>
+          <w:bCs/>
+        </w:rPr>
+        <w:t xml:space="preserve"> </w:t>
+      </w:r>
+      <w:r>
+        <w:rPr>
+          <w:b/>
+          <w:bCs/>
+        </w:rPr>
+        <w:t>Adaptative</w:t>
+      </w:r>
+      <w:r>
+        <w:rPr>
+          <w:b/>
+          <w:bCs/>
+        </w:rPr>
+        <w:t>Max</w:t>
+      </w:r>
+      <w:r>
+        <w:rPr>
+          <w:b/>
+          <w:bCs/>
+        </w:rPr>
+        <w:t>Pool</w:t>
+      </w:r>
+      <w:r>
+        <w:rPr>
+          <w:b/>
+          <w:bCs/>
+          <w:color w:val="000000"/>
+        </w:rPr>
+        <w:t xml:space="preserve"> and </w:t>
+      </w:r>
+      <w:r>
+        <w:rPr>
+          <w:b/>
+          <w:bCs/>
+          <w:color w:val="000000"/>
+        </w:rPr>
+        <w:t>reduced-pooling model</w:t>
+      </w:r>
+      <w:r>
+        <w:rPr>
+          <w:b/>
+          <w:bCs/>
+          <w:color w:val="000000"/>
+        </w:rPr>
+        <w:t>:</w:t>
+      </w:r>
+      <w:r>
+        <w:rPr>
+          <w:color w:val="000000"/>
+        </w:rPr>
+        <w:t xml:space="preserve"> </w:t>
+      </w:r>
+      <w:r>
+        <w:t>Build upon the modification in the first version, the second version used the same encoder and pooling strategies as V1, but upgrade the final summary values of features. This version uses AdaptativeAvgPool3D(1) and AdaptativeMaxPoo3D(1) and concatenate in a 124 vection before the final linear transformation and prediction. This improvement aimed in maintain the ability of our network in learn spatial information regarding the overal pattern (Average Pooling) and focal signals (Max pooling)</w:t>
+      </w:r>
+      <w:r>
+        <w:t xml:space="preserve">; </w:t>
+      </w:r>
+      <w:r>
+        <w:rPr>
+          <w:b/>
+          <w:bCs/>
+        </w:rPr>
+        <w:t>Version 3</w:t>
+      </w:r>
+      <w:r>
+        <w:rPr>
+          <w:b/>
+          <w:bCs/>
+        </w:rPr>
+        <w:t xml:space="preserve"> – Avg+Max reduced-pooling + </w:t>
+      </w:r>
+      <w:r>
+        <w:rPr>
+          <w:rStyle w:val="Strong"/>
+          <w:rFonts w:eastAsiaTheme="majorEastAsia"/>
+          <w:b w:val="0"/>
+          <w:bCs w:val="0"/>
+          <w:color w:val="000000"/>
+        </w:rPr>
+        <w:t>Class Weighting</w:t>
+      </w:r>
+      <w:r>
+        <w:rPr>
+          <w:b/>
+          <w:bCs/>
+        </w:rPr>
+        <w:t>:</w:t>
+      </w:r>
+      <w:r>
+        <w:t xml:space="preserve"> </w:t>
+      </w:r>
+      <w:r>
+        <w:t xml:space="preserve">We used the V2 as initial model for training with the training set of CHIMERA cohort. As an important caveat, the </w:t>
+      </w:r>
+      <w:r>
+        <w:t xml:space="preserve">CHIMERA cohort contain an imbalance between </w:t>
+      </w:r>
+      <w:r>
+        <w:t>positive BCR and negative BRC. As the classes contribute equally to the learning and calculation of total loss, the model would to give more attention for the most frequent class. With this, the final model would have a bad performance predicting the positive cases. To account for this, we added a weighted cross entropy to manually reescale the weight given to each class</w:t>
+      </w:r>
+      <w:r>
+        <w:t xml:space="preserve">; </w:t>
+      </w:r>
+      <w:r>
+        <w:rPr>
+          <w:b/>
+          <w:bCs/>
+        </w:rPr>
+        <w:t xml:space="preserve">Version 4 </w:t>
+      </w:r>
+      <w:r>
+        <w:rPr>
+          <w:b/>
+          <w:bCs/>
+        </w:rPr>
+        <w:t xml:space="preserve">– </w:t>
+      </w:r>
+      <w:r>
+        <w:rPr>
+          <w:b/>
+          <w:bCs/>
+        </w:rPr>
+        <w:t xml:space="preserve">Avg+Max reduced-pooling + </w:t>
+      </w:r>
+      <w:r>
+        <w:rPr>
+          <w:rStyle w:val="Strong"/>
+          <w:rFonts w:eastAsiaTheme="majorEastAsia"/>
+          <w:color w:val="000000"/>
+        </w:rPr>
+        <w:t>Class Weighting</w:t>
+      </w:r>
+      <w:r>
+        <w:rPr>
+          <w:b/>
+          <w:bCs/>
+        </w:rPr>
+        <w:t xml:space="preserve"> model + </w:t>
+      </w:r>
+      <w:r>
+        <w:rPr>
+          <w:b/>
+          <w:bCs/>
+          <w:color w:val="000000"/>
+        </w:rPr>
+        <w:t>adjusted probability threshold</w:t>
+      </w:r>
+      <w:r>
+        <w:rPr>
+          <w:b/>
+          <w:bCs/>
+          <w:color w:val="000000"/>
+        </w:rPr>
+        <w:t xml:space="preserve">: </w:t>
+      </w:r>
+      <w:r>
+        <w:rPr>
+          <w:color w:val="000000"/>
+        </w:rPr>
+        <w:t xml:space="preserve">We then moved to out next approach, which used the same architechture of version 2-4, but adjusted the threshold for calling the positive class from default 0.5 to prob &gt;=44. This changed was based on output probabilities generated by V3 and evalatuaion of the algorithms calls. The less stringent cutoff improved </w:t>
+      </w:r>
+      <w:r>
+        <w:rPr>
+          <w:color w:val="000000"/>
+        </w:rPr>
+        <w:t xml:space="preserve">sensitivity/positive calls </w:t>
+      </w:r>
+      <w:r>
+        <w:rPr>
+          <w:color w:val="000000"/>
+        </w:rPr>
+        <w:t>of the algorithms.</w:t>
+      </w:r>
+      <w:r>
+        <w:rPr>
+          <w:color w:val="000000"/>
+        </w:rPr>
+        <w:t xml:space="preserve"> </w:t>
+      </w:r>
+      <w:r>
+        <w:rPr>
+          <w:b/>
+          <w:bCs/>
+        </w:rPr>
+        <w:t>Updated</w:t>
+      </w:r>
+      <w:r>
+        <w:rPr>
+          <w:b/>
+          <w:bCs/>
+        </w:rPr>
+        <w:t xml:space="preserve"> architecture – Independent training for each modality in mpMRI</w:t>
+      </w:r>
+      <w:r>
+        <w:rPr>
+          <w:b/>
+          <w:bCs/>
+        </w:rPr>
+        <w:t xml:space="preserve">: </w:t>
+      </w:r>
+    </w:p>
+    <w:p>
+      <w:pPr>
+        <w:jc w:val="both"/>
+      </w:pPr>
+      <w:r>
+        <w:t>Our first strategy to acquire the embeddings from CHIMERA cohort used an early fusion approach of mpMRI modalities into a single channel (3, D, H, W) as input for the 3D-CNN. However, each channel cary distinct information and is responsible to acquire separate information like anatomic (T2W), diffusion of contranst (ADC), and lesion conspicuity (HBV/DW1). Thefore, because of this heterogenoues signal are not always interchanchable, early fusion strategy would miss important information carried by each channel. We dicided to use three modality-specific stems, one for T2W, one for ADC, and one for HBV/DW1, and then concatenate it in a shared trunk.</w:t>
+      </w:r>
+    </w:p>
+    <w:p>
+      <w:pPr>
+        <w:ind w:firstLine="720"/>
+        <w:jc w:val="both"/>
+      </w:pPr>
+      <w:r>
+        <w:t>The performance of each strategy was tested in early test cohort of 20 patients and evaluated in terms of accuracy, F1-score, and AUC. The best model was then pre-trained in PICAI cohort (n=1500) for representation learning of clinical significant (csPCA) lesion from mpMRI data. A second step of transfer learning was then performed in whole CHIMERA cohort (n=96) to extract the embedings for all patients</w:t>
+      </w:r>
+      <w:r>
+        <w:t xml:space="preserve"> in a global patient-level (1x64D or 1x128) and sequence-wise dimention </w:t>
+      </w:r>
+      <w:r>
+        <w:t>(</w:t>
+      </w:r>
+      <w:r>
+        <w:t>24x128 and 48x128)</w:t>
+      </w:r>
+      <w:r>
+        <w:t>.</w:t>
+      </w:r>
+      <w:r>
+        <w:t xml:space="preserve"> </w:t>
+      </w:r>
+      <w:r>
+        <w:t xml:space="preserve">All models were implemented in Pytorch, for 40 epochs, learning rate of 1e-4, seed=42, early stop = 8, dropout =0.3, Adam optimizer with withgt decay = </w:t>
+      </w:r>
+      <w:r>
+        <w:t>1e-4</w:t>
+      </w:r>
+      <w:r>
+        <w:t xml:space="preserve">, on </w:t>
+      </w:r>
+      <w:r>
+        <w:t>NVIDIA H200</w:t>
+      </w:r>
+      <w:r>
+        <w:t xml:space="preserve"> GPU. </w:t>
+      </w:r>
+    </w:p>
+    <w:p>
+      <w:pPr>
+        <w:jc w:val="both"/>
+      </w:pPr>
+    </w:p>
+    <w:p>
+      <w:pPr>
+        <w:jc w:val="both"/>
+      </w:pPr>
+    </w:p>
+    <w:p>
+      <w:pPr>
+        <w:jc w:val="both"/>
+      </w:pPr>
+    </w:p>
+    <w:p>
+      <w:pPr>
+        <w:jc w:val="both"/>
+      </w:pPr>
+    </w:p>
+    <w:p>
+      <w:pPr>
+        <w:jc w:val="both"/>
+      </w:pPr>
+    </w:p>
+    <w:p>
+      <w:pPr>
+        <w:jc w:val="both"/>
+      </w:pPr>
+    </w:p>
+    <w:p>
+      <w:pPr>
+        <w:pStyle w:val="font-claude-response-body"/>
+      </w:pPr>
+      <w:r>
+        <w:t xml:space="preserve">The two architectures share the same stem design and pooling philosophy, but diverge at the critical pooling decision after Enc3. The BCR model applies a </w:t>
+      </w:r>
+      <w:r>
+        <w:rPr>
+          <w:rStyle w:val="HTMLCode"/>
+          <w:rFonts w:eastAsiaTheme="majorEastAsia"/>
+        </w:rPr>
+        <w:t>(2,2,2)</w:t>
+      </w:r>
+      <w:r>
+        <w:t xml:space="preserve"> pool there to collapse the depth axis and produce a compact global representation — appropriate since the downstream task is a single patient-level label. The slice-aware model keeps </w:t>
+      </w:r>
+      <w:r>
+        <w:rPr>
+          <w:rStyle w:val="HTMLCode"/>
+          <w:rFonts w:eastAsiaTheme="majorEastAsia"/>
+        </w:rPr>
+        <w:t>(1,2,2)</w:t>
+      </w:r>
+      <w:r>
+        <w:t xml:space="preserve"> throughout, trading that compactness for a spatially ordered sequence of tokens, which is only possible because the task justifies the extra dimensionality and the larger PI-CAI training set can support it.</w:t>
+      </w:r>
+    </w:p>
+    <w:p>
+      <w:pPr>
+        <w:pStyle w:val="font-claude-response-body"/>
+      </w:pPr>
+      <w:r>
+        <w:t xml:space="preserve">The embedding shapes reflect this: 1×64 for BCR (one vector per patient, per fold), versus 48×128 + 1×128 for the slice-aware model (a sequence and its summary). This dual output is what makes the slice-aware embeddings richer for downstream use — the sequence </w:t>
+      </w:r>
+      <w:r>
+        <w:rPr>
+          <w:rStyle w:val="HTMLCode"/>
+          <w:rFonts w:eastAsiaTheme="majorEastAsia"/>
+        </w:rPr>
+        <w:t>z_seq</w:t>
+      </w:r>
+      <w:r>
+        <w:t xml:space="preserve"> can feed sequence models, attention-based survival networks, or simply be visualised per-slice to understand where in the gland the model concentrates signal.</w:t>
+      </w:r>
+    </w:p>
+    <w:p>
+      <w:pPr>
+        <w:jc w:val="both"/>
+      </w:pPr>
     </w:p>
     <w:sectPr>
       <w:pgSz w:w="12240" w:h="15840"/>
@@ -10760,7 +11339,7 @@
   <w:style w:type="paragraph" w:default="1" w:styleId="Normal">
     <w:name w:val="Normal"/>
     <w:qFormat/>
-    <w:rsid w:val="00DC1469"/>
+    <w:rsid w:val="00F95188"/>
     <w:rPr>
       <w:rFonts w:ascii="Times New Roman" w:eastAsia="Times New Roman" w:hAnsi="Times New Roman" w:cs="Times New Roman"/>
       <w:kern w:val="0"/>
@@ -11328,6 +11907,14 @@
       <w:spacing w:before="100" w:beforeAutospacing="1" w:after="100" w:afterAutospacing="1"/>
     </w:pPr>
   </w:style>
+  <w:style w:type="paragraph" w:customStyle="1" w:styleId="font-claude-response-body">
+    <w:name w:val="font-claude-response-body"/>
+    <w:basedOn w:val="Normal"/>
+    <w:rsid w:val="004F7F2D"/>
+    <w:pPr>
+      <w:spacing w:before="100" w:beforeAutospacing="1" w:after="100" w:afterAutospacing="1"/>
+    </w:pPr>
+  </w:style>
 </w:styles>
 </file>
 

</xml_diff>